<commit_message>
Fix IQ Protocol doc: tables ran off the page, wrong page size
Root cause of "tables cut off on the right": the four step tables
(5.1-5.4) had column widths summing to 11,600 DXA — wider than even
US Letter's own printable width (10,080 DXA at 0.75in margins), so
every step table already overran the right margin regardless of page
size. On top of that the page was set to US Letter, not A4.

Switched the page to A4 (11906x16838) and rescaled every table
(step tables, deviations table, signature table) proportionally so
each sums exactly to the 9,746 DXA content width (A4 minus 0.75in
margins on both sides). No content changed — same steps, same
wording, same sections.
</commit_message>
<xml_diff>
--- a/docs/regulatory/IQ_Protocol_v1.0.docx
+++ b/docs/regulatory/IQ_Protocol_v1.0.docx
@@ -354,7 +354,7 @@
     </w:p>
     <w:tbl>
       <w:tblPr>
-        <w:tblW w:type="dxa" w:w="11600"/>
+        <w:tblW w:type="dxa" w:w="9746"/>
         <w:tblBorders>
           <w:top w:val="single" w:color="auto" w:sz="4"/>
           <w:left w:val="single" w:color="auto" w:sz="4"/>
@@ -365,12 +365,12 @@
         </w:tblBorders>
       </w:tblPr>
       <w:tblGrid>
-        <w:gridCol w:w="500"/>
-        <w:gridCol w:w="3400"/>
-        <w:gridCol w:w="3400"/>
-        <w:gridCol w:w="2000"/>
-        <w:gridCol w:w="1000"/>
-        <w:gridCol w:w="1300"/>
+        <w:gridCol w:w="420"/>
+        <w:gridCol w:w="2856"/>
+        <w:gridCol w:w="2856"/>
+        <w:gridCol w:w="1680"/>
+        <w:gridCol w:w="840"/>
+        <w:gridCol w:w="1094"/>
       </w:tblGrid>
       <w:tr>
         <w:trPr>
@@ -378,7 +378,7 @@
         </w:trPr>
         <w:tc>
           <w:tcPr>
-            <w:tcW w:type="dxa" w:w="500"/>
+            <w:tcW w:type="dxa" w:w="420"/>
             <w:shd w:fill="0B1E3D" w:val="clear"/>
             <w:tcMar>
               <w:top w:type="dxa" w:w="80"/>
@@ -406,7 +406,7 @@
         </w:tc>
         <w:tc>
           <w:tcPr>
-            <w:tcW w:type="dxa" w:w="3400"/>
+            <w:tcW w:type="dxa" w:w="2856"/>
             <w:shd w:fill="0B1E3D" w:val="clear"/>
             <w:tcMar>
               <w:top w:type="dxa" w:w="80"/>
@@ -434,7 +434,7 @@
         </w:tc>
         <w:tc>
           <w:tcPr>
-            <w:tcW w:type="dxa" w:w="3400"/>
+            <w:tcW w:type="dxa" w:w="2856"/>
             <w:shd w:fill="0B1E3D" w:val="clear"/>
             <w:tcMar>
               <w:top w:type="dxa" w:w="80"/>
@@ -462,7 +462,7 @@
         </w:tc>
         <w:tc>
           <w:tcPr>
-            <w:tcW w:type="dxa" w:w="2000"/>
+            <w:tcW w:type="dxa" w:w="1680"/>
             <w:shd w:fill="0B1E3D" w:val="clear"/>
             <w:tcMar>
               <w:top w:type="dxa" w:w="80"/>
@@ -490,7 +490,7 @@
         </w:tc>
         <w:tc>
           <w:tcPr>
-            <w:tcW w:type="dxa" w:w="1000"/>
+            <w:tcW w:type="dxa" w:w="840"/>
             <w:shd w:fill="0B1E3D" w:val="clear"/>
             <w:tcMar>
               <w:top w:type="dxa" w:w="80"/>
@@ -518,7 +518,7 @@
         </w:tc>
         <w:tc>
           <w:tcPr>
-            <w:tcW w:type="dxa" w:w="1300"/>
+            <w:tcW w:type="dxa" w:w="1094"/>
             <w:shd w:fill="0B1E3D" w:val="clear"/>
             <w:tcMar>
               <w:top w:type="dxa" w:w="80"/>
@@ -548,7 +548,7 @@
       <w:tr>
         <w:tc>
           <w:tcPr>
-            <w:tcW w:type="dxa" w:w="500"/>
+            <w:tcW w:type="dxa" w:w="420"/>
             <w:shd w:fill="F1F5F9" w:val="clear"/>
             <w:tcMar>
               <w:top w:type="dxa" w:w="80"/>
@@ -576,7 +576,7 @@
         </w:tc>
         <w:tc>
           <w:tcPr>
-            <w:tcW w:type="dxa" w:w="3400"/>
+            <w:tcW w:type="dxa" w:w="2856"/>
             <w:tcMar>
               <w:top w:type="dxa" w:w="80"/>
               <w:left w:type="dxa" w:w="100"/>
@@ -612,7 +612,7 @@
         </w:tc>
         <w:tc>
           <w:tcPr>
-            <w:tcW w:type="dxa" w:w="3400"/>
+            <w:tcW w:type="dxa" w:w="2856"/>
             <w:tcMar>
               <w:top w:type="dxa" w:w="80"/>
               <w:left w:type="dxa" w:w="100"/>
@@ -632,47 +632,47 @@
         </w:tc>
         <w:tc>
           <w:tcPr>
-            <w:tcW w:type="dxa" w:w="2000"/>
-            <w:tcMar>
-              <w:top w:type="dxa" w:w="200"/>
-              <w:left w:type="dxa" w:w="100"/>
-              <w:bottom w:type="dxa" w:w="200"/>
-              <w:right w:type="dxa" w:w="100"/>
-            </w:tcMar>
-          </w:tcPr>
-          <w:p>
-            <w:r>
-              <w:rPr>
-                <w:sz w:val="18"/>
-                <w:szCs w:val="18"/>
-              </w:rPr>
-              <w:t xml:space="preserve"/>
-            </w:r>
-          </w:p>
-        </w:tc>
-        <w:tc>
-          <w:tcPr>
-            <w:tcW w:type="dxa" w:w="1000"/>
-            <w:tcMar>
-              <w:top w:type="dxa" w:w="200"/>
-              <w:left w:type="dxa" w:w="100"/>
-              <w:bottom w:type="dxa" w:w="200"/>
-              <w:right w:type="dxa" w:w="100"/>
-            </w:tcMar>
-          </w:tcPr>
-          <w:p>
-            <w:r>
-              <w:rPr>
-                <w:sz w:val="18"/>
-                <w:szCs w:val="18"/>
-              </w:rPr>
-              <w:t xml:space="preserve"/>
-            </w:r>
-          </w:p>
-        </w:tc>
-        <w:tc>
-          <w:tcPr>
-            <w:tcW w:type="dxa" w:w="1300"/>
+            <w:tcW w:type="dxa" w:w="1680"/>
+            <w:tcMar>
+              <w:top w:type="dxa" w:w="200"/>
+              <w:left w:type="dxa" w:w="100"/>
+              <w:bottom w:type="dxa" w:w="200"/>
+              <w:right w:type="dxa" w:w="100"/>
+            </w:tcMar>
+          </w:tcPr>
+          <w:p>
+            <w:r>
+              <w:rPr>
+                <w:sz w:val="18"/>
+                <w:szCs w:val="18"/>
+              </w:rPr>
+              <w:t xml:space="preserve"/>
+            </w:r>
+          </w:p>
+        </w:tc>
+        <w:tc>
+          <w:tcPr>
+            <w:tcW w:type="dxa" w:w="840"/>
+            <w:tcMar>
+              <w:top w:type="dxa" w:w="200"/>
+              <w:left w:type="dxa" w:w="100"/>
+              <w:bottom w:type="dxa" w:w="200"/>
+              <w:right w:type="dxa" w:w="100"/>
+            </w:tcMar>
+          </w:tcPr>
+          <w:p>
+            <w:r>
+              <w:rPr>
+                <w:sz w:val="18"/>
+                <w:szCs w:val="18"/>
+              </w:rPr>
+              <w:t xml:space="preserve"/>
+            </w:r>
+          </w:p>
+        </w:tc>
+        <w:tc>
+          <w:tcPr>
+            <w:tcW w:type="dxa" w:w="1094"/>
             <w:tcMar>
               <w:top w:type="dxa" w:w="200"/>
               <w:left w:type="dxa" w:w="100"/>
@@ -694,7 +694,7 @@
       <w:tr>
         <w:tc>
           <w:tcPr>
-            <w:tcW w:type="dxa" w:w="500"/>
+            <w:tcW w:type="dxa" w:w="420"/>
             <w:shd w:fill="F1F5F9" w:val="clear"/>
             <w:tcMar>
               <w:top w:type="dxa" w:w="80"/>
@@ -722,7 +722,7 @@
         </w:tc>
         <w:tc>
           <w:tcPr>
-            <w:tcW w:type="dxa" w:w="3400"/>
+            <w:tcW w:type="dxa" w:w="2856"/>
             <w:tcMar>
               <w:top w:type="dxa" w:w="80"/>
               <w:left w:type="dxa" w:w="100"/>
@@ -758,7 +758,7 @@
         </w:tc>
         <w:tc>
           <w:tcPr>
-            <w:tcW w:type="dxa" w:w="3400"/>
+            <w:tcW w:type="dxa" w:w="2856"/>
             <w:tcMar>
               <w:top w:type="dxa" w:w="80"/>
               <w:left w:type="dxa" w:w="100"/>
@@ -778,47 +778,47 @@
         </w:tc>
         <w:tc>
           <w:tcPr>
-            <w:tcW w:type="dxa" w:w="2000"/>
-            <w:tcMar>
-              <w:top w:type="dxa" w:w="200"/>
-              <w:left w:type="dxa" w:w="100"/>
-              <w:bottom w:type="dxa" w:w="200"/>
-              <w:right w:type="dxa" w:w="100"/>
-            </w:tcMar>
-          </w:tcPr>
-          <w:p>
-            <w:r>
-              <w:rPr>
-                <w:sz w:val="18"/>
-                <w:szCs w:val="18"/>
-              </w:rPr>
-              <w:t xml:space="preserve"/>
-            </w:r>
-          </w:p>
-        </w:tc>
-        <w:tc>
-          <w:tcPr>
-            <w:tcW w:type="dxa" w:w="1000"/>
-            <w:tcMar>
-              <w:top w:type="dxa" w:w="200"/>
-              <w:left w:type="dxa" w:w="100"/>
-              <w:bottom w:type="dxa" w:w="200"/>
-              <w:right w:type="dxa" w:w="100"/>
-            </w:tcMar>
-          </w:tcPr>
-          <w:p>
-            <w:r>
-              <w:rPr>
-                <w:sz w:val="18"/>
-                <w:szCs w:val="18"/>
-              </w:rPr>
-              <w:t xml:space="preserve"/>
-            </w:r>
-          </w:p>
-        </w:tc>
-        <w:tc>
-          <w:tcPr>
-            <w:tcW w:type="dxa" w:w="1300"/>
+            <w:tcW w:type="dxa" w:w="1680"/>
+            <w:tcMar>
+              <w:top w:type="dxa" w:w="200"/>
+              <w:left w:type="dxa" w:w="100"/>
+              <w:bottom w:type="dxa" w:w="200"/>
+              <w:right w:type="dxa" w:w="100"/>
+            </w:tcMar>
+          </w:tcPr>
+          <w:p>
+            <w:r>
+              <w:rPr>
+                <w:sz w:val="18"/>
+                <w:szCs w:val="18"/>
+              </w:rPr>
+              <w:t xml:space="preserve"/>
+            </w:r>
+          </w:p>
+        </w:tc>
+        <w:tc>
+          <w:tcPr>
+            <w:tcW w:type="dxa" w:w="840"/>
+            <w:tcMar>
+              <w:top w:type="dxa" w:w="200"/>
+              <w:left w:type="dxa" w:w="100"/>
+              <w:bottom w:type="dxa" w:w="200"/>
+              <w:right w:type="dxa" w:w="100"/>
+            </w:tcMar>
+          </w:tcPr>
+          <w:p>
+            <w:r>
+              <w:rPr>
+                <w:sz w:val="18"/>
+                <w:szCs w:val="18"/>
+              </w:rPr>
+              <w:t xml:space="preserve"/>
+            </w:r>
+          </w:p>
+        </w:tc>
+        <w:tc>
+          <w:tcPr>
+            <w:tcW w:type="dxa" w:w="1094"/>
             <w:tcMar>
               <w:top w:type="dxa" w:w="200"/>
               <w:left w:type="dxa" w:w="100"/>
@@ -866,7 +866,7 @@
     </w:p>
     <w:tbl>
       <w:tblPr>
-        <w:tblW w:type="dxa" w:w="11600"/>
+        <w:tblW w:type="dxa" w:w="9746"/>
         <w:tblBorders>
           <w:top w:val="single" w:color="auto" w:sz="4"/>
           <w:left w:val="single" w:color="auto" w:sz="4"/>
@@ -877,12 +877,12 @@
         </w:tblBorders>
       </w:tblPr>
       <w:tblGrid>
-        <w:gridCol w:w="500"/>
-        <w:gridCol w:w="3400"/>
-        <w:gridCol w:w="3400"/>
-        <w:gridCol w:w="2000"/>
-        <w:gridCol w:w="1000"/>
-        <w:gridCol w:w="1300"/>
+        <w:gridCol w:w="420"/>
+        <w:gridCol w:w="2856"/>
+        <w:gridCol w:w="2856"/>
+        <w:gridCol w:w="1680"/>
+        <w:gridCol w:w="840"/>
+        <w:gridCol w:w="1094"/>
       </w:tblGrid>
       <w:tr>
         <w:trPr>
@@ -890,7 +890,7 @@
         </w:trPr>
         <w:tc>
           <w:tcPr>
-            <w:tcW w:type="dxa" w:w="500"/>
+            <w:tcW w:type="dxa" w:w="420"/>
             <w:shd w:fill="0B1E3D" w:val="clear"/>
             <w:tcMar>
               <w:top w:type="dxa" w:w="80"/>
@@ -918,7 +918,7 @@
         </w:tc>
         <w:tc>
           <w:tcPr>
-            <w:tcW w:type="dxa" w:w="3400"/>
+            <w:tcW w:type="dxa" w:w="2856"/>
             <w:shd w:fill="0B1E3D" w:val="clear"/>
             <w:tcMar>
               <w:top w:type="dxa" w:w="80"/>
@@ -946,7 +946,7 @@
         </w:tc>
         <w:tc>
           <w:tcPr>
-            <w:tcW w:type="dxa" w:w="3400"/>
+            <w:tcW w:type="dxa" w:w="2856"/>
             <w:shd w:fill="0B1E3D" w:val="clear"/>
             <w:tcMar>
               <w:top w:type="dxa" w:w="80"/>
@@ -974,7 +974,7 @@
         </w:tc>
         <w:tc>
           <w:tcPr>
-            <w:tcW w:type="dxa" w:w="2000"/>
+            <w:tcW w:type="dxa" w:w="1680"/>
             <w:shd w:fill="0B1E3D" w:val="clear"/>
             <w:tcMar>
               <w:top w:type="dxa" w:w="80"/>
@@ -1002,7 +1002,7 @@
         </w:tc>
         <w:tc>
           <w:tcPr>
-            <w:tcW w:type="dxa" w:w="1000"/>
+            <w:tcW w:type="dxa" w:w="840"/>
             <w:shd w:fill="0B1E3D" w:val="clear"/>
             <w:tcMar>
               <w:top w:type="dxa" w:w="80"/>
@@ -1030,7 +1030,7 @@
         </w:tc>
         <w:tc>
           <w:tcPr>
-            <w:tcW w:type="dxa" w:w="1300"/>
+            <w:tcW w:type="dxa" w:w="1094"/>
             <w:shd w:fill="0B1E3D" w:val="clear"/>
             <w:tcMar>
               <w:top w:type="dxa" w:w="80"/>
@@ -1060,7 +1060,7 @@
       <w:tr>
         <w:tc>
           <w:tcPr>
-            <w:tcW w:type="dxa" w:w="500"/>
+            <w:tcW w:type="dxa" w:w="420"/>
             <w:shd w:fill="F1F5F9" w:val="clear"/>
             <w:tcMar>
               <w:top w:type="dxa" w:w="80"/>
@@ -1088,7 +1088,7 @@
         </w:tc>
         <w:tc>
           <w:tcPr>
-            <w:tcW w:type="dxa" w:w="3400"/>
+            <w:tcW w:type="dxa" w:w="2856"/>
             <w:tcMar>
               <w:top w:type="dxa" w:w="80"/>
               <w:left w:type="dxa" w:w="100"/>
@@ -1124,7 +1124,7 @@
         </w:tc>
         <w:tc>
           <w:tcPr>
-            <w:tcW w:type="dxa" w:w="3400"/>
+            <w:tcW w:type="dxa" w:w="2856"/>
             <w:tcMar>
               <w:top w:type="dxa" w:w="80"/>
               <w:left w:type="dxa" w:w="100"/>
@@ -1144,47 +1144,47 @@
         </w:tc>
         <w:tc>
           <w:tcPr>
-            <w:tcW w:type="dxa" w:w="2000"/>
-            <w:tcMar>
-              <w:top w:type="dxa" w:w="200"/>
-              <w:left w:type="dxa" w:w="100"/>
-              <w:bottom w:type="dxa" w:w="200"/>
-              <w:right w:type="dxa" w:w="100"/>
-            </w:tcMar>
-          </w:tcPr>
-          <w:p>
-            <w:r>
-              <w:rPr>
-                <w:sz w:val="18"/>
-                <w:szCs w:val="18"/>
-              </w:rPr>
-              <w:t xml:space="preserve"/>
-            </w:r>
-          </w:p>
-        </w:tc>
-        <w:tc>
-          <w:tcPr>
-            <w:tcW w:type="dxa" w:w="1000"/>
-            <w:tcMar>
-              <w:top w:type="dxa" w:w="200"/>
-              <w:left w:type="dxa" w:w="100"/>
-              <w:bottom w:type="dxa" w:w="200"/>
-              <w:right w:type="dxa" w:w="100"/>
-            </w:tcMar>
-          </w:tcPr>
-          <w:p>
-            <w:r>
-              <w:rPr>
-                <w:sz w:val="18"/>
-                <w:szCs w:val="18"/>
-              </w:rPr>
-              <w:t xml:space="preserve"/>
-            </w:r>
-          </w:p>
-        </w:tc>
-        <w:tc>
-          <w:tcPr>
-            <w:tcW w:type="dxa" w:w="1300"/>
+            <w:tcW w:type="dxa" w:w="1680"/>
+            <w:tcMar>
+              <w:top w:type="dxa" w:w="200"/>
+              <w:left w:type="dxa" w:w="100"/>
+              <w:bottom w:type="dxa" w:w="200"/>
+              <w:right w:type="dxa" w:w="100"/>
+            </w:tcMar>
+          </w:tcPr>
+          <w:p>
+            <w:r>
+              <w:rPr>
+                <w:sz w:val="18"/>
+                <w:szCs w:val="18"/>
+              </w:rPr>
+              <w:t xml:space="preserve"/>
+            </w:r>
+          </w:p>
+        </w:tc>
+        <w:tc>
+          <w:tcPr>
+            <w:tcW w:type="dxa" w:w="840"/>
+            <w:tcMar>
+              <w:top w:type="dxa" w:w="200"/>
+              <w:left w:type="dxa" w:w="100"/>
+              <w:bottom w:type="dxa" w:w="200"/>
+              <w:right w:type="dxa" w:w="100"/>
+            </w:tcMar>
+          </w:tcPr>
+          <w:p>
+            <w:r>
+              <w:rPr>
+                <w:sz w:val="18"/>
+                <w:szCs w:val="18"/>
+              </w:rPr>
+              <w:t xml:space="preserve"/>
+            </w:r>
+          </w:p>
+        </w:tc>
+        <w:tc>
+          <w:tcPr>
+            <w:tcW w:type="dxa" w:w="1094"/>
             <w:tcMar>
               <w:top w:type="dxa" w:w="200"/>
               <w:left w:type="dxa" w:w="100"/>
@@ -1206,7 +1206,7 @@
       <w:tr>
         <w:tc>
           <w:tcPr>
-            <w:tcW w:type="dxa" w:w="500"/>
+            <w:tcW w:type="dxa" w:w="420"/>
             <w:shd w:fill="F1F5F9" w:val="clear"/>
             <w:tcMar>
               <w:top w:type="dxa" w:w="80"/>
@@ -1234,7 +1234,7 @@
         </w:tc>
         <w:tc>
           <w:tcPr>
-            <w:tcW w:type="dxa" w:w="3400"/>
+            <w:tcW w:type="dxa" w:w="2856"/>
             <w:tcMar>
               <w:top w:type="dxa" w:w="80"/>
               <w:left w:type="dxa" w:w="100"/>
@@ -1270,7 +1270,7 @@
         </w:tc>
         <w:tc>
           <w:tcPr>
-            <w:tcW w:type="dxa" w:w="3400"/>
+            <w:tcW w:type="dxa" w:w="2856"/>
             <w:tcMar>
               <w:top w:type="dxa" w:w="80"/>
               <w:left w:type="dxa" w:w="100"/>
@@ -1290,47 +1290,47 @@
         </w:tc>
         <w:tc>
           <w:tcPr>
-            <w:tcW w:type="dxa" w:w="2000"/>
-            <w:tcMar>
-              <w:top w:type="dxa" w:w="200"/>
-              <w:left w:type="dxa" w:w="100"/>
-              <w:bottom w:type="dxa" w:w="200"/>
-              <w:right w:type="dxa" w:w="100"/>
-            </w:tcMar>
-          </w:tcPr>
-          <w:p>
-            <w:r>
-              <w:rPr>
-                <w:sz w:val="18"/>
-                <w:szCs w:val="18"/>
-              </w:rPr>
-              <w:t xml:space="preserve"/>
-            </w:r>
-          </w:p>
-        </w:tc>
-        <w:tc>
-          <w:tcPr>
-            <w:tcW w:type="dxa" w:w="1000"/>
-            <w:tcMar>
-              <w:top w:type="dxa" w:w="200"/>
-              <w:left w:type="dxa" w:w="100"/>
-              <w:bottom w:type="dxa" w:w="200"/>
-              <w:right w:type="dxa" w:w="100"/>
-            </w:tcMar>
-          </w:tcPr>
-          <w:p>
-            <w:r>
-              <w:rPr>
-                <w:sz w:val="18"/>
-                <w:szCs w:val="18"/>
-              </w:rPr>
-              <w:t xml:space="preserve"/>
-            </w:r>
-          </w:p>
-        </w:tc>
-        <w:tc>
-          <w:tcPr>
-            <w:tcW w:type="dxa" w:w="1300"/>
+            <w:tcW w:type="dxa" w:w="1680"/>
+            <w:tcMar>
+              <w:top w:type="dxa" w:w="200"/>
+              <w:left w:type="dxa" w:w="100"/>
+              <w:bottom w:type="dxa" w:w="200"/>
+              <w:right w:type="dxa" w:w="100"/>
+            </w:tcMar>
+          </w:tcPr>
+          <w:p>
+            <w:r>
+              <w:rPr>
+                <w:sz w:val="18"/>
+                <w:szCs w:val="18"/>
+              </w:rPr>
+              <w:t xml:space="preserve"/>
+            </w:r>
+          </w:p>
+        </w:tc>
+        <w:tc>
+          <w:tcPr>
+            <w:tcW w:type="dxa" w:w="840"/>
+            <w:tcMar>
+              <w:top w:type="dxa" w:w="200"/>
+              <w:left w:type="dxa" w:w="100"/>
+              <w:bottom w:type="dxa" w:w="200"/>
+              <w:right w:type="dxa" w:w="100"/>
+            </w:tcMar>
+          </w:tcPr>
+          <w:p>
+            <w:r>
+              <w:rPr>
+                <w:sz w:val="18"/>
+                <w:szCs w:val="18"/>
+              </w:rPr>
+              <w:t xml:space="preserve"/>
+            </w:r>
+          </w:p>
+        </w:tc>
+        <w:tc>
+          <w:tcPr>
+            <w:tcW w:type="dxa" w:w="1094"/>
             <w:tcMar>
               <w:top w:type="dxa" w:w="200"/>
               <w:left w:type="dxa" w:w="100"/>
@@ -1378,7 +1378,7 @@
     </w:p>
     <w:tbl>
       <w:tblPr>
-        <w:tblW w:type="dxa" w:w="11600"/>
+        <w:tblW w:type="dxa" w:w="9746"/>
         <w:tblBorders>
           <w:top w:val="single" w:color="auto" w:sz="4"/>
           <w:left w:val="single" w:color="auto" w:sz="4"/>
@@ -1389,12 +1389,12 @@
         </w:tblBorders>
       </w:tblPr>
       <w:tblGrid>
-        <w:gridCol w:w="500"/>
-        <w:gridCol w:w="3400"/>
-        <w:gridCol w:w="3400"/>
-        <w:gridCol w:w="2000"/>
-        <w:gridCol w:w="1000"/>
-        <w:gridCol w:w="1300"/>
+        <w:gridCol w:w="420"/>
+        <w:gridCol w:w="2856"/>
+        <w:gridCol w:w="2856"/>
+        <w:gridCol w:w="1680"/>
+        <w:gridCol w:w="840"/>
+        <w:gridCol w:w="1094"/>
       </w:tblGrid>
       <w:tr>
         <w:trPr>
@@ -1402,7 +1402,7 @@
         </w:trPr>
         <w:tc>
           <w:tcPr>
-            <w:tcW w:type="dxa" w:w="500"/>
+            <w:tcW w:type="dxa" w:w="420"/>
             <w:shd w:fill="0B1E3D" w:val="clear"/>
             <w:tcMar>
               <w:top w:type="dxa" w:w="80"/>
@@ -1430,7 +1430,7 @@
         </w:tc>
         <w:tc>
           <w:tcPr>
-            <w:tcW w:type="dxa" w:w="3400"/>
+            <w:tcW w:type="dxa" w:w="2856"/>
             <w:shd w:fill="0B1E3D" w:val="clear"/>
             <w:tcMar>
               <w:top w:type="dxa" w:w="80"/>
@@ -1458,7 +1458,7 @@
         </w:tc>
         <w:tc>
           <w:tcPr>
-            <w:tcW w:type="dxa" w:w="3400"/>
+            <w:tcW w:type="dxa" w:w="2856"/>
             <w:shd w:fill="0B1E3D" w:val="clear"/>
             <w:tcMar>
               <w:top w:type="dxa" w:w="80"/>
@@ -1486,7 +1486,7 @@
         </w:tc>
         <w:tc>
           <w:tcPr>
-            <w:tcW w:type="dxa" w:w="2000"/>
+            <w:tcW w:type="dxa" w:w="1680"/>
             <w:shd w:fill="0B1E3D" w:val="clear"/>
             <w:tcMar>
               <w:top w:type="dxa" w:w="80"/>
@@ -1514,7 +1514,7 @@
         </w:tc>
         <w:tc>
           <w:tcPr>
-            <w:tcW w:type="dxa" w:w="1000"/>
+            <w:tcW w:type="dxa" w:w="840"/>
             <w:shd w:fill="0B1E3D" w:val="clear"/>
             <w:tcMar>
               <w:top w:type="dxa" w:w="80"/>
@@ -1542,7 +1542,7 @@
         </w:tc>
         <w:tc>
           <w:tcPr>
-            <w:tcW w:type="dxa" w:w="1300"/>
+            <w:tcW w:type="dxa" w:w="1094"/>
             <w:shd w:fill="0B1E3D" w:val="clear"/>
             <w:tcMar>
               <w:top w:type="dxa" w:w="80"/>
@@ -1572,7 +1572,7 @@
       <w:tr>
         <w:tc>
           <w:tcPr>
-            <w:tcW w:type="dxa" w:w="500"/>
+            <w:tcW w:type="dxa" w:w="420"/>
             <w:shd w:fill="F1F5F9" w:val="clear"/>
             <w:tcMar>
               <w:top w:type="dxa" w:w="80"/>
@@ -1600,7 +1600,7 @@
         </w:tc>
         <w:tc>
           <w:tcPr>
-            <w:tcW w:type="dxa" w:w="3400"/>
+            <w:tcW w:type="dxa" w:w="2856"/>
             <w:tcMar>
               <w:top w:type="dxa" w:w="80"/>
               <w:left w:type="dxa" w:w="100"/>
@@ -1623,7 +1623,7 @@
         </w:tc>
         <w:tc>
           <w:tcPr>
-            <w:tcW w:type="dxa" w:w="3400"/>
+            <w:tcW w:type="dxa" w:w="2856"/>
             <w:tcMar>
               <w:top w:type="dxa" w:w="80"/>
               <w:left w:type="dxa" w:w="100"/>
@@ -1643,47 +1643,47 @@
         </w:tc>
         <w:tc>
           <w:tcPr>
-            <w:tcW w:type="dxa" w:w="2000"/>
-            <w:tcMar>
-              <w:top w:type="dxa" w:w="200"/>
-              <w:left w:type="dxa" w:w="100"/>
-              <w:bottom w:type="dxa" w:w="200"/>
-              <w:right w:type="dxa" w:w="100"/>
-            </w:tcMar>
-          </w:tcPr>
-          <w:p>
-            <w:r>
-              <w:rPr>
-                <w:sz w:val="18"/>
-                <w:szCs w:val="18"/>
-              </w:rPr>
-              <w:t xml:space="preserve"/>
-            </w:r>
-          </w:p>
-        </w:tc>
-        <w:tc>
-          <w:tcPr>
-            <w:tcW w:type="dxa" w:w="1000"/>
-            <w:tcMar>
-              <w:top w:type="dxa" w:w="200"/>
-              <w:left w:type="dxa" w:w="100"/>
-              <w:bottom w:type="dxa" w:w="200"/>
-              <w:right w:type="dxa" w:w="100"/>
-            </w:tcMar>
-          </w:tcPr>
-          <w:p>
-            <w:r>
-              <w:rPr>
-                <w:sz w:val="18"/>
-                <w:szCs w:val="18"/>
-              </w:rPr>
-              <w:t xml:space="preserve"/>
-            </w:r>
-          </w:p>
-        </w:tc>
-        <w:tc>
-          <w:tcPr>
-            <w:tcW w:type="dxa" w:w="1300"/>
+            <w:tcW w:type="dxa" w:w="1680"/>
+            <w:tcMar>
+              <w:top w:type="dxa" w:w="200"/>
+              <w:left w:type="dxa" w:w="100"/>
+              <w:bottom w:type="dxa" w:w="200"/>
+              <w:right w:type="dxa" w:w="100"/>
+            </w:tcMar>
+          </w:tcPr>
+          <w:p>
+            <w:r>
+              <w:rPr>
+                <w:sz w:val="18"/>
+                <w:szCs w:val="18"/>
+              </w:rPr>
+              <w:t xml:space="preserve"/>
+            </w:r>
+          </w:p>
+        </w:tc>
+        <w:tc>
+          <w:tcPr>
+            <w:tcW w:type="dxa" w:w="840"/>
+            <w:tcMar>
+              <w:top w:type="dxa" w:w="200"/>
+              <w:left w:type="dxa" w:w="100"/>
+              <w:bottom w:type="dxa" w:w="200"/>
+              <w:right w:type="dxa" w:w="100"/>
+            </w:tcMar>
+          </w:tcPr>
+          <w:p>
+            <w:r>
+              <w:rPr>
+                <w:sz w:val="18"/>
+                <w:szCs w:val="18"/>
+              </w:rPr>
+              <w:t xml:space="preserve"/>
+            </w:r>
+          </w:p>
+        </w:tc>
+        <w:tc>
+          <w:tcPr>
+            <w:tcW w:type="dxa" w:w="1094"/>
             <w:tcMar>
               <w:top w:type="dxa" w:w="200"/>
               <w:left w:type="dxa" w:w="100"/>
@@ -1705,7 +1705,7 @@
       <w:tr>
         <w:tc>
           <w:tcPr>
-            <w:tcW w:type="dxa" w:w="500"/>
+            <w:tcW w:type="dxa" w:w="420"/>
             <w:shd w:fill="F1F5F9" w:val="clear"/>
             <w:tcMar>
               <w:top w:type="dxa" w:w="80"/>
@@ -1733,7 +1733,7 @@
         </w:tc>
         <w:tc>
           <w:tcPr>
-            <w:tcW w:type="dxa" w:w="3400"/>
+            <w:tcW w:type="dxa" w:w="2856"/>
             <w:tcMar>
               <w:top w:type="dxa" w:w="80"/>
               <w:left w:type="dxa" w:w="100"/>
@@ -1769,7 +1769,7 @@
         </w:tc>
         <w:tc>
           <w:tcPr>
-            <w:tcW w:type="dxa" w:w="3400"/>
+            <w:tcW w:type="dxa" w:w="2856"/>
             <w:tcMar>
               <w:top w:type="dxa" w:w="80"/>
               <w:left w:type="dxa" w:w="100"/>
@@ -1789,47 +1789,47 @@
         </w:tc>
         <w:tc>
           <w:tcPr>
-            <w:tcW w:type="dxa" w:w="2000"/>
-            <w:tcMar>
-              <w:top w:type="dxa" w:w="200"/>
-              <w:left w:type="dxa" w:w="100"/>
-              <w:bottom w:type="dxa" w:w="200"/>
-              <w:right w:type="dxa" w:w="100"/>
-            </w:tcMar>
-          </w:tcPr>
-          <w:p>
-            <w:r>
-              <w:rPr>
-                <w:sz w:val="18"/>
-                <w:szCs w:val="18"/>
-              </w:rPr>
-              <w:t xml:space="preserve"/>
-            </w:r>
-          </w:p>
-        </w:tc>
-        <w:tc>
-          <w:tcPr>
-            <w:tcW w:type="dxa" w:w="1000"/>
-            <w:tcMar>
-              <w:top w:type="dxa" w:w="200"/>
-              <w:left w:type="dxa" w:w="100"/>
-              <w:bottom w:type="dxa" w:w="200"/>
-              <w:right w:type="dxa" w:w="100"/>
-            </w:tcMar>
-          </w:tcPr>
-          <w:p>
-            <w:r>
-              <w:rPr>
-                <w:sz w:val="18"/>
-                <w:szCs w:val="18"/>
-              </w:rPr>
-              <w:t xml:space="preserve"/>
-            </w:r>
-          </w:p>
-        </w:tc>
-        <w:tc>
-          <w:tcPr>
-            <w:tcW w:type="dxa" w:w="1300"/>
+            <w:tcW w:type="dxa" w:w="1680"/>
+            <w:tcMar>
+              <w:top w:type="dxa" w:w="200"/>
+              <w:left w:type="dxa" w:w="100"/>
+              <w:bottom w:type="dxa" w:w="200"/>
+              <w:right w:type="dxa" w:w="100"/>
+            </w:tcMar>
+          </w:tcPr>
+          <w:p>
+            <w:r>
+              <w:rPr>
+                <w:sz w:val="18"/>
+                <w:szCs w:val="18"/>
+              </w:rPr>
+              <w:t xml:space="preserve"/>
+            </w:r>
+          </w:p>
+        </w:tc>
+        <w:tc>
+          <w:tcPr>
+            <w:tcW w:type="dxa" w:w="840"/>
+            <w:tcMar>
+              <w:top w:type="dxa" w:w="200"/>
+              <w:left w:type="dxa" w:w="100"/>
+              <w:bottom w:type="dxa" w:w="200"/>
+              <w:right w:type="dxa" w:w="100"/>
+            </w:tcMar>
+          </w:tcPr>
+          <w:p>
+            <w:r>
+              <w:rPr>
+                <w:sz w:val="18"/>
+                <w:szCs w:val="18"/>
+              </w:rPr>
+              <w:t xml:space="preserve"/>
+            </w:r>
+          </w:p>
+        </w:tc>
+        <w:tc>
+          <w:tcPr>
+            <w:tcW w:type="dxa" w:w="1094"/>
             <w:tcMar>
               <w:top w:type="dxa" w:w="200"/>
               <w:left w:type="dxa" w:w="100"/>
@@ -1877,7 +1877,7 @@
     </w:p>
     <w:tbl>
       <w:tblPr>
-        <w:tblW w:type="dxa" w:w="11600"/>
+        <w:tblW w:type="dxa" w:w="9746"/>
         <w:tblBorders>
           <w:top w:val="single" w:color="auto" w:sz="4"/>
           <w:left w:val="single" w:color="auto" w:sz="4"/>
@@ -1888,12 +1888,12 @@
         </w:tblBorders>
       </w:tblPr>
       <w:tblGrid>
-        <w:gridCol w:w="500"/>
-        <w:gridCol w:w="3400"/>
-        <w:gridCol w:w="3400"/>
-        <w:gridCol w:w="2000"/>
-        <w:gridCol w:w="1000"/>
-        <w:gridCol w:w="1300"/>
+        <w:gridCol w:w="420"/>
+        <w:gridCol w:w="2856"/>
+        <w:gridCol w:w="2856"/>
+        <w:gridCol w:w="1680"/>
+        <w:gridCol w:w="840"/>
+        <w:gridCol w:w="1094"/>
       </w:tblGrid>
       <w:tr>
         <w:trPr>
@@ -1901,7 +1901,7 @@
         </w:trPr>
         <w:tc>
           <w:tcPr>
-            <w:tcW w:type="dxa" w:w="500"/>
+            <w:tcW w:type="dxa" w:w="420"/>
             <w:shd w:fill="0B1E3D" w:val="clear"/>
             <w:tcMar>
               <w:top w:type="dxa" w:w="80"/>
@@ -1929,7 +1929,7 @@
         </w:tc>
         <w:tc>
           <w:tcPr>
-            <w:tcW w:type="dxa" w:w="3400"/>
+            <w:tcW w:type="dxa" w:w="2856"/>
             <w:shd w:fill="0B1E3D" w:val="clear"/>
             <w:tcMar>
               <w:top w:type="dxa" w:w="80"/>
@@ -1957,7 +1957,7 @@
         </w:tc>
         <w:tc>
           <w:tcPr>
-            <w:tcW w:type="dxa" w:w="3400"/>
+            <w:tcW w:type="dxa" w:w="2856"/>
             <w:shd w:fill="0B1E3D" w:val="clear"/>
             <w:tcMar>
               <w:top w:type="dxa" w:w="80"/>
@@ -1985,7 +1985,7 @@
         </w:tc>
         <w:tc>
           <w:tcPr>
-            <w:tcW w:type="dxa" w:w="2000"/>
+            <w:tcW w:type="dxa" w:w="1680"/>
             <w:shd w:fill="0B1E3D" w:val="clear"/>
             <w:tcMar>
               <w:top w:type="dxa" w:w="80"/>
@@ -2013,7 +2013,7 @@
         </w:tc>
         <w:tc>
           <w:tcPr>
-            <w:tcW w:type="dxa" w:w="1000"/>
+            <w:tcW w:type="dxa" w:w="840"/>
             <w:shd w:fill="0B1E3D" w:val="clear"/>
             <w:tcMar>
               <w:top w:type="dxa" w:w="80"/>
@@ -2041,7 +2041,7 @@
         </w:tc>
         <w:tc>
           <w:tcPr>
-            <w:tcW w:type="dxa" w:w="1300"/>
+            <w:tcW w:type="dxa" w:w="1094"/>
             <w:shd w:fill="0B1E3D" w:val="clear"/>
             <w:tcMar>
               <w:top w:type="dxa" w:w="80"/>
@@ -2071,7 +2071,7 @@
       <w:tr>
         <w:tc>
           <w:tcPr>
-            <w:tcW w:type="dxa" w:w="500"/>
+            <w:tcW w:type="dxa" w:w="420"/>
             <w:shd w:fill="F1F5F9" w:val="clear"/>
             <w:tcMar>
               <w:top w:type="dxa" w:w="80"/>
@@ -2099,7 +2099,7 @@
         </w:tc>
         <w:tc>
           <w:tcPr>
-            <w:tcW w:type="dxa" w:w="3400"/>
+            <w:tcW w:type="dxa" w:w="2856"/>
             <w:tcMar>
               <w:top w:type="dxa" w:w="80"/>
               <w:left w:type="dxa" w:w="100"/>
@@ -2122,7 +2122,7 @@
         </w:tc>
         <w:tc>
           <w:tcPr>
-            <w:tcW w:type="dxa" w:w="3400"/>
+            <w:tcW w:type="dxa" w:w="2856"/>
             <w:tcMar>
               <w:top w:type="dxa" w:w="80"/>
               <w:left w:type="dxa" w:w="100"/>
@@ -2142,47 +2142,47 @@
         </w:tc>
         <w:tc>
           <w:tcPr>
-            <w:tcW w:type="dxa" w:w="2000"/>
-            <w:tcMar>
-              <w:top w:type="dxa" w:w="200"/>
-              <w:left w:type="dxa" w:w="100"/>
-              <w:bottom w:type="dxa" w:w="200"/>
-              <w:right w:type="dxa" w:w="100"/>
-            </w:tcMar>
-          </w:tcPr>
-          <w:p>
-            <w:r>
-              <w:rPr>
-                <w:sz w:val="18"/>
-                <w:szCs w:val="18"/>
-              </w:rPr>
-              <w:t xml:space="preserve"/>
-            </w:r>
-          </w:p>
-        </w:tc>
-        <w:tc>
-          <w:tcPr>
-            <w:tcW w:type="dxa" w:w="1000"/>
-            <w:tcMar>
-              <w:top w:type="dxa" w:w="200"/>
-              <w:left w:type="dxa" w:w="100"/>
-              <w:bottom w:type="dxa" w:w="200"/>
-              <w:right w:type="dxa" w:w="100"/>
-            </w:tcMar>
-          </w:tcPr>
-          <w:p>
-            <w:r>
-              <w:rPr>
-                <w:sz w:val="18"/>
-                <w:szCs w:val="18"/>
-              </w:rPr>
-              <w:t xml:space="preserve"/>
-            </w:r>
-          </w:p>
-        </w:tc>
-        <w:tc>
-          <w:tcPr>
-            <w:tcW w:type="dxa" w:w="1300"/>
+            <w:tcW w:type="dxa" w:w="1680"/>
+            <w:tcMar>
+              <w:top w:type="dxa" w:w="200"/>
+              <w:left w:type="dxa" w:w="100"/>
+              <w:bottom w:type="dxa" w:w="200"/>
+              <w:right w:type="dxa" w:w="100"/>
+            </w:tcMar>
+          </w:tcPr>
+          <w:p>
+            <w:r>
+              <w:rPr>
+                <w:sz w:val="18"/>
+                <w:szCs w:val="18"/>
+              </w:rPr>
+              <w:t xml:space="preserve"/>
+            </w:r>
+          </w:p>
+        </w:tc>
+        <w:tc>
+          <w:tcPr>
+            <w:tcW w:type="dxa" w:w="840"/>
+            <w:tcMar>
+              <w:top w:type="dxa" w:w="200"/>
+              <w:left w:type="dxa" w:w="100"/>
+              <w:bottom w:type="dxa" w:w="200"/>
+              <w:right w:type="dxa" w:w="100"/>
+            </w:tcMar>
+          </w:tcPr>
+          <w:p>
+            <w:r>
+              <w:rPr>
+                <w:sz w:val="18"/>
+                <w:szCs w:val="18"/>
+              </w:rPr>
+              <w:t xml:space="preserve"/>
+            </w:r>
+          </w:p>
+        </w:tc>
+        <w:tc>
+          <w:tcPr>
+            <w:tcW w:type="dxa" w:w="1094"/>
             <w:tcMar>
               <w:top w:type="dxa" w:w="200"/>
               <w:left w:type="dxa" w:w="100"/>
@@ -2204,7 +2204,7 @@
       <w:tr>
         <w:tc>
           <w:tcPr>
-            <w:tcW w:type="dxa" w:w="500"/>
+            <w:tcW w:type="dxa" w:w="420"/>
             <w:shd w:fill="F1F5F9" w:val="clear"/>
             <w:tcMar>
               <w:top w:type="dxa" w:w="80"/>
@@ -2232,7 +2232,7 @@
         </w:tc>
         <w:tc>
           <w:tcPr>
-            <w:tcW w:type="dxa" w:w="3400"/>
+            <w:tcW w:type="dxa" w:w="2856"/>
             <w:tcMar>
               <w:top w:type="dxa" w:w="80"/>
               <w:left w:type="dxa" w:w="100"/>
@@ -2268,7 +2268,7 @@
         </w:tc>
         <w:tc>
           <w:tcPr>
-            <w:tcW w:type="dxa" w:w="3400"/>
+            <w:tcW w:type="dxa" w:w="2856"/>
             <w:tcMar>
               <w:top w:type="dxa" w:w="80"/>
               <w:left w:type="dxa" w:w="100"/>
@@ -2288,47 +2288,47 @@
         </w:tc>
         <w:tc>
           <w:tcPr>
-            <w:tcW w:type="dxa" w:w="2000"/>
-            <w:tcMar>
-              <w:top w:type="dxa" w:w="200"/>
-              <w:left w:type="dxa" w:w="100"/>
-              <w:bottom w:type="dxa" w:w="200"/>
-              <w:right w:type="dxa" w:w="100"/>
-            </w:tcMar>
-          </w:tcPr>
-          <w:p>
-            <w:r>
-              <w:rPr>
-                <w:sz w:val="18"/>
-                <w:szCs w:val="18"/>
-              </w:rPr>
-              <w:t xml:space="preserve"/>
-            </w:r>
-          </w:p>
-        </w:tc>
-        <w:tc>
-          <w:tcPr>
-            <w:tcW w:type="dxa" w:w="1000"/>
-            <w:tcMar>
-              <w:top w:type="dxa" w:w="200"/>
-              <w:left w:type="dxa" w:w="100"/>
-              <w:bottom w:type="dxa" w:w="200"/>
-              <w:right w:type="dxa" w:w="100"/>
-            </w:tcMar>
-          </w:tcPr>
-          <w:p>
-            <w:r>
-              <w:rPr>
-                <w:sz w:val="18"/>
-                <w:szCs w:val="18"/>
-              </w:rPr>
-              <w:t xml:space="preserve"/>
-            </w:r>
-          </w:p>
-        </w:tc>
-        <w:tc>
-          <w:tcPr>
-            <w:tcW w:type="dxa" w:w="1300"/>
+            <w:tcW w:type="dxa" w:w="1680"/>
+            <w:tcMar>
+              <w:top w:type="dxa" w:w="200"/>
+              <w:left w:type="dxa" w:w="100"/>
+              <w:bottom w:type="dxa" w:w="200"/>
+              <w:right w:type="dxa" w:w="100"/>
+            </w:tcMar>
+          </w:tcPr>
+          <w:p>
+            <w:r>
+              <w:rPr>
+                <w:sz w:val="18"/>
+                <w:szCs w:val="18"/>
+              </w:rPr>
+              <w:t xml:space="preserve"/>
+            </w:r>
+          </w:p>
+        </w:tc>
+        <w:tc>
+          <w:tcPr>
+            <w:tcW w:type="dxa" w:w="840"/>
+            <w:tcMar>
+              <w:top w:type="dxa" w:w="200"/>
+              <w:left w:type="dxa" w:w="100"/>
+              <w:bottom w:type="dxa" w:w="200"/>
+              <w:right w:type="dxa" w:w="100"/>
+            </w:tcMar>
+          </w:tcPr>
+          <w:p>
+            <w:r>
+              <w:rPr>
+                <w:sz w:val="18"/>
+                <w:szCs w:val="18"/>
+              </w:rPr>
+              <w:t xml:space="preserve"/>
+            </w:r>
+          </w:p>
+        </w:tc>
+        <w:tc>
+          <w:tcPr>
+            <w:tcW w:type="dxa" w:w="1094"/>
             <w:tcMar>
               <w:top w:type="dxa" w:w="200"/>
               <w:left w:type="dxa" w:w="100"/>
@@ -2402,7 +2402,7 @@
     </w:p>
     <w:tbl>
       <w:tblPr>
-        <w:tblW w:type="dxa" w:w="10400"/>
+        <w:tblW w:type="dxa" w:w="9746"/>
         <w:tblBorders>
           <w:top w:val="single" w:color="auto" w:sz="4"/>
           <w:left w:val="single" w:color="auto" w:sz="4"/>
@@ -2413,15 +2413,15 @@
         </w:tblBorders>
       </w:tblPr>
       <w:tblGrid>
-        <w:gridCol w:w="700"/>
-        <w:gridCol w:w="3600"/>
-        <w:gridCol w:w="3600"/>
-        <w:gridCol w:w="2500"/>
+        <w:gridCol w:w="656"/>
+        <w:gridCol w:w="3374"/>
+        <w:gridCol w:w="3374"/>
+        <w:gridCol w:w="2342"/>
       </w:tblGrid>
       <w:tr>
         <w:tc>
           <w:tcPr>
-            <w:tcW w:type="dxa" w:w="700"/>
+            <w:tcW w:type="dxa" w:w="656"/>
             <w:shd w:fill="0B1E3D" w:val="clear"/>
             <w:tcMar>
               <w:top w:type="dxa" w:w="80"/>
@@ -2449,7 +2449,7 @@
         </w:tc>
         <w:tc>
           <w:tcPr>
-            <w:tcW w:type="dxa" w:w="3600"/>
+            <w:tcW w:type="dxa" w:w="3374"/>
             <w:shd w:fill="0B1E3D" w:val="clear"/>
             <w:tcMar>
               <w:top w:type="dxa" w:w="80"/>
@@ -2477,7 +2477,7 @@
         </w:tc>
         <w:tc>
           <w:tcPr>
-            <w:tcW w:type="dxa" w:w="3600"/>
+            <w:tcW w:type="dxa" w:w="3374"/>
             <w:shd w:fill="0B1E3D" w:val="clear"/>
             <w:tcMar>
               <w:top w:type="dxa" w:w="80"/>
@@ -2505,7 +2505,7 @@
         </w:tc>
         <w:tc>
           <w:tcPr>
-            <w:tcW w:type="dxa" w:w="2500"/>
+            <w:tcW w:type="dxa" w:w="2342"/>
             <w:shd w:fill="0B1E3D" w:val="clear"/>
             <w:tcMar>
               <w:top w:type="dxa" w:w="80"/>
@@ -2535,67 +2535,67 @@
       <w:tr>
         <w:tc>
           <w:tcPr>
-            <w:tcW w:type="dxa" w:w="700"/>
-            <w:tcMar>
-              <w:top w:type="dxa" w:w="200"/>
-              <w:left w:type="dxa" w:w="100"/>
-              <w:bottom w:type="dxa" w:w="200"/>
-              <w:right w:type="dxa" w:w="100"/>
-            </w:tcMar>
-          </w:tcPr>
-          <w:p>
-            <w:r>
-              <w:rPr>
-                <w:sz w:val="18"/>
-                <w:szCs w:val="18"/>
-              </w:rPr>
-              <w:t xml:space="preserve"/>
-            </w:r>
-          </w:p>
-        </w:tc>
-        <w:tc>
-          <w:tcPr>
-            <w:tcW w:type="dxa" w:w="3600"/>
-            <w:tcMar>
-              <w:top w:type="dxa" w:w="200"/>
-              <w:left w:type="dxa" w:w="100"/>
-              <w:bottom w:type="dxa" w:w="200"/>
-              <w:right w:type="dxa" w:w="100"/>
-            </w:tcMar>
-          </w:tcPr>
-          <w:p>
-            <w:r>
-              <w:rPr>
-                <w:sz w:val="18"/>
-                <w:szCs w:val="18"/>
-              </w:rPr>
-              <w:t xml:space="preserve"/>
-            </w:r>
-          </w:p>
-        </w:tc>
-        <w:tc>
-          <w:tcPr>
-            <w:tcW w:type="dxa" w:w="3600"/>
-            <w:tcMar>
-              <w:top w:type="dxa" w:w="200"/>
-              <w:left w:type="dxa" w:w="100"/>
-              <w:bottom w:type="dxa" w:w="200"/>
-              <w:right w:type="dxa" w:w="100"/>
-            </w:tcMar>
-          </w:tcPr>
-          <w:p>
-            <w:r>
-              <w:rPr>
-                <w:sz w:val="18"/>
-                <w:szCs w:val="18"/>
-              </w:rPr>
-              <w:t xml:space="preserve"/>
-            </w:r>
-          </w:p>
-        </w:tc>
-        <w:tc>
-          <w:tcPr>
-            <w:tcW w:type="dxa" w:w="2500"/>
+            <w:tcW w:type="dxa" w:w="656"/>
+            <w:tcMar>
+              <w:top w:type="dxa" w:w="200"/>
+              <w:left w:type="dxa" w:w="100"/>
+              <w:bottom w:type="dxa" w:w="200"/>
+              <w:right w:type="dxa" w:w="100"/>
+            </w:tcMar>
+          </w:tcPr>
+          <w:p>
+            <w:r>
+              <w:rPr>
+                <w:sz w:val="18"/>
+                <w:szCs w:val="18"/>
+              </w:rPr>
+              <w:t xml:space="preserve"/>
+            </w:r>
+          </w:p>
+        </w:tc>
+        <w:tc>
+          <w:tcPr>
+            <w:tcW w:type="dxa" w:w="3374"/>
+            <w:tcMar>
+              <w:top w:type="dxa" w:w="200"/>
+              <w:left w:type="dxa" w:w="100"/>
+              <w:bottom w:type="dxa" w:w="200"/>
+              <w:right w:type="dxa" w:w="100"/>
+            </w:tcMar>
+          </w:tcPr>
+          <w:p>
+            <w:r>
+              <w:rPr>
+                <w:sz w:val="18"/>
+                <w:szCs w:val="18"/>
+              </w:rPr>
+              <w:t xml:space="preserve"/>
+            </w:r>
+          </w:p>
+        </w:tc>
+        <w:tc>
+          <w:tcPr>
+            <w:tcW w:type="dxa" w:w="3374"/>
+            <w:tcMar>
+              <w:top w:type="dxa" w:w="200"/>
+              <w:left w:type="dxa" w:w="100"/>
+              <w:bottom w:type="dxa" w:w="200"/>
+              <w:right w:type="dxa" w:w="100"/>
+            </w:tcMar>
+          </w:tcPr>
+          <w:p>
+            <w:r>
+              <w:rPr>
+                <w:sz w:val="18"/>
+                <w:szCs w:val="18"/>
+              </w:rPr>
+              <w:t xml:space="preserve"/>
+            </w:r>
+          </w:p>
+        </w:tc>
+        <w:tc>
+          <w:tcPr>
+            <w:tcW w:type="dxa" w:w="2342"/>
             <w:tcMar>
               <w:top w:type="dxa" w:w="200"/>
               <w:left w:type="dxa" w:w="100"/>
@@ -2617,67 +2617,67 @@
       <w:tr>
         <w:tc>
           <w:tcPr>
-            <w:tcW w:type="dxa" w:w="700"/>
-            <w:tcMar>
-              <w:top w:type="dxa" w:w="200"/>
-              <w:left w:type="dxa" w:w="100"/>
-              <w:bottom w:type="dxa" w:w="200"/>
-              <w:right w:type="dxa" w:w="100"/>
-            </w:tcMar>
-          </w:tcPr>
-          <w:p>
-            <w:r>
-              <w:rPr>
-                <w:sz w:val="18"/>
-                <w:szCs w:val="18"/>
-              </w:rPr>
-              <w:t xml:space="preserve"/>
-            </w:r>
-          </w:p>
-        </w:tc>
-        <w:tc>
-          <w:tcPr>
-            <w:tcW w:type="dxa" w:w="3600"/>
-            <w:tcMar>
-              <w:top w:type="dxa" w:w="200"/>
-              <w:left w:type="dxa" w:w="100"/>
-              <w:bottom w:type="dxa" w:w="200"/>
-              <w:right w:type="dxa" w:w="100"/>
-            </w:tcMar>
-          </w:tcPr>
-          <w:p>
-            <w:r>
-              <w:rPr>
-                <w:sz w:val="18"/>
-                <w:szCs w:val="18"/>
-              </w:rPr>
-              <w:t xml:space="preserve"/>
-            </w:r>
-          </w:p>
-        </w:tc>
-        <w:tc>
-          <w:tcPr>
-            <w:tcW w:type="dxa" w:w="3600"/>
-            <w:tcMar>
-              <w:top w:type="dxa" w:w="200"/>
-              <w:left w:type="dxa" w:w="100"/>
-              <w:bottom w:type="dxa" w:w="200"/>
-              <w:right w:type="dxa" w:w="100"/>
-            </w:tcMar>
-          </w:tcPr>
-          <w:p>
-            <w:r>
-              <w:rPr>
-                <w:sz w:val="18"/>
-                <w:szCs w:val="18"/>
-              </w:rPr>
-              <w:t xml:space="preserve"/>
-            </w:r>
-          </w:p>
-        </w:tc>
-        <w:tc>
-          <w:tcPr>
-            <w:tcW w:type="dxa" w:w="2500"/>
+            <w:tcW w:type="dxa" w:w="656"/>
+            <w:tcMar>
+              <w:top w:type="dxa" w:w="200"/>
+              <w:left w:type="dxa" w:w="100"/>
+              <w:bottom w:type="dxa" w:w="200"/>
+              <w:right w:type="dxa" w:w="100"/>
+            </w:tcMar>
+          </w:tcPr>
+          <w:p>
+            <w:r>
+              <w:rPr>
+                <w:sz w:val="18"/>
+                <w:szCs w:val="18"/>
+              </w:rPr>
+              <w:t xml:space="preserve"/>
+            </w:r>
+          </w:p>
+        </w:tc>
+        <w:tc>
+          <w:tcPr>
+            <w:tcW w:type="dxa" w:w="3374"/>
+            <w:tcMar>
+              <w:top w:type="dxa" w:w="200"/>
+              <w:left w:type="dxa" w:w="100"/>
+              <w:bottom w:type="dxa" w:w="200"/>
+              <w:right w:type="dxa" w:w="100"/>
+            </w:tcMar>
+          </w:tcPr>
+          <w:p>
+            <w:r>
+              <w:rPr>
+                <w:sz w:val="18"/>
+                <w:szCs w:val="18"/>
+              </w:rPr>
+              <w:t xml:space="preserve"/>
+            </w:r>
+          </w:p>
+        </w:tc>
+        <w:tc>
+          <w:tcPr>
+            <w:tcW w:type="dxa" w:w="3374"/>
+            <w:tcMar>
+              <w:top w:type="dxa" w:w="200"/>
+              <w:left w:type="dxa" w:w="100"/>
+              <w:bottom w:type="dxa" w:w="200"/>
+              <w:right w:type="dxa" w:w="100"/>
+            </w:tcMar>
+          </w:tcPr>
+          <w:p>
+            <w:r>
+              <w:rPr>
+                <w:sz w:val="18"/>
+                <w:szCs w:val="18"/>
+              </w:rPr>
+              <w:t xml:space="preserve"/>
+            </w:r>
+          </w:p>
+        </w:tc>
+        <w:tc>
+          <w:tcPr>
+            <w:tcW w:type="dxa" w:w="2342"/>
             <w:tcMar>
               <w:top w:type="dxa" w:w="200"/>
               <w:left w:type="dxa" w:w="100"/>
@@ -2725,7 +2725,7 @@
     </w:p>
     <w:tbl>
       <w:tblPr>
-        <w:tblW w:type="dxa" w:w="9600"/>
+        <w:tblW w:type="dxa" w:w="9746"/>
         <w:tblBorders>
           <w:top w:val="single" w:color="auto" w:sz="4"/>
           <w:left w:val="single" w:color="auto" w:sz="4"/>
@@ -2736,14 +2736,14 @@
         </w:tblBorders>
       </w:tblPr>
       <w:tblGrid>
-        <w:gridCol w:w="3200"/>
-        <w:gridCol w:w="3200"/>
-        <w:gridCol w:w="3200"/>
+        <w:gridCol w:w="3249"/>
+        <w:gridCol w:w="3249"/>
+        <w:gridCol w:w="3248"/>
       </w:tblGrid>
       <w:tr>
         <w:tc>
           <w:tcPr>
-            <w:tcW w:type="dxa" w:w="3200"/>
+            <w:tcW w:type="dxa" w:w="3249"/>
             <w:shd w:fill="0B1E3D" w:val="clear"/>
             <w:tcMar>
               <w:top w:type="dxa" w:w="80"/>
@@ -2771,7 +2771,7 @@
         </w:tc>
         <w:tc>
           <w:tcPr>
-            <w:tcW w:type="dxa" w:w="3200"/>
+            <w:tcW w:type="dxa" w:w="3249"/>
             <w:shd w:fill="0B1E3D" w:val="clear"/>
             <w:tcMar>
               <w:top w:type="dxa" w:w="80"/>
@@ -2799,7 +2799,7 @@
         </w:tc>
         <w:tc>
           <w:tcPr>
-            <w:tcW w:type="dxa" w:w="3200"/>
+            <w:tcW w:type="dxa" w:w="3248"/>
             <w:shd w:fill="0B1E3D" w:val="clear"/>
             <w:tcMar>
               <w:top w:type="dxa" w:w="80"/>
@@ -2829,7 +2829,7 @@
       <w:tr>
         <w:tc>
           <w:tcPr>
-            <w:tcW w:type="dxa" w:w="3200"/>
+            <w:tcW w:type="dxa" w:w="3249"/>
             <w:shd w:fill="F1F5F9" w:val="clear"/>
             <w:tcMar>
               <w:top w:type="dxa" w:w="80"/>
@@ -2857,27 +2857,27 @@
         </w:tc>
         <w:tc>
           <w:tcPr>
-            <w:tcW w:type="dxa" w:w="3200"/>
-            <w:tcMar>
-              <w:top w:type="dxa" w:w="200"/>
-              <w:left w:type="dxa" w:w="100"/>
-              <w:bottom w:type="dxa" w:w="200"/>
-              <w:right w:type="dxa" w:w="100"/>
-            </w:tcMar>
-          </w:tcPr>
-          <w:p>
-            <w:r>
-              <w:rPr>
-                <w:sz w:val="18"/>
-                <w:szCs w:val="18"/>
-              </w:rPr>
-              <w:t xml:space="preserve"/>
-            </w:r>
-          </w:p>
-        </w:tc>
-        <w:tc>
-          <w:tcPr>
-            <w:tcW w:type="dxa" w:w="3200"/>
+            <w:tcW w:type="dxa" w:w="3249"/>
+            <w:tcMar>
+              <w:top w:type="dxa" w:w="200"/>
+              <w:left w:type="dxa" w:w="100"/>
+              <w:bottom w:type="dxa" w:w="200"/>
+              <w:right w:type="dxa" w:w="100"/>
+            </w:tcMar>
+          </w:tcPr>
+          <w:p>
+            <w:r>
+              <w:rPr>
+                <w:sz w:val="18"/>
+                <w:szCs w:val="18"/>
+              </w:rPr>
+              <w:t xml:space="preserve"/>
+            </w:r>
+          </w:p>
+        </w:tc>
+        <w:tc>
+          <w:tcPr>
+            <w:tcW w:type="dxa" w:w="3248"/>
             <w:tcMar>
               <w:top w:type="dxa" w:w="200"/>
               <w:left w:type="dxa" w:w="100"/>
@@ -2899,7 +2899,7 @@
       <w:tr>
         <w:tc>
           <w:tcPr>
-            <w:tcW w:type="dxa" w:w="3200"/>
+            <w:tcW w:type="dxa" w:w="3249"/>
             <w:shd w:fill="F1F5F9" w:val="clear"/>
             <w:tcMar>
               <w:top w:type="dxa" w:w="80"/>
@@ -2927,27 +2927,27 @@
         </w:tc>
         <w:tc>
           <w:tcPr>
-            <w:tcW w:type="dxa" w:w="3200"/>
-            <w:tcMar>
-              <w:top w:type="dxa" w:w="200"/>
-              <w:left w:type="dxa" w:w="100"/>
-              <w:bottom w:type="dxa" w:w="200"/>
-              <w:right w:type="dxa" w:w="100"/>
-            </w:tcMar>
-          </w:tcPr>
-          <w:p>
-            <w:r>
-              <w:rPr>
-                <w:sz w:val="18"/>
-                <w:szCs w:val="18"/>
-              </w:rPr>
-              <w:t xml:space="preserve"/>
-            </w:r>
-          </w:p>
-        </w:tc>
-        <w:tc>
-          <w:tcPr>
-            <w:tcW w:type="dxa" w:w="3200"/>
+            <w:tcW w:type="dxa" w:w="3249"/>
+            <w:tcMar>
+              <w:top w:type="dxa" w:w="200"/>
+              <w:left w:type="dxa" w:w="100"/>
+              <w:bottom w:type="dxa" w:w="200"/>
+              <w:right w:type="dxa" w:w="100"/>
+            </w:tcMar>
+          </w:tcPr>
+          <w:p>
+            <w:r>
+              <w:rPr>
+                <w:sz w:val="18"/>
+                <w:szCs w:val="18"/>
+              </w:rPr>
+              <w:t xml:space="preserve"/>
+            </w:r>
+          </w:p>
+        </w:tc>
+        <w:tc>
+          <w:tcPr>
+            <w:tcW w:type="dxa" w:w="3248"/>
             <w:tcMar>
               <w:top w:type="dxa" w:w="200"/>
               <w:left w:type="dxa" w:w="100"/>
@@ -2968,7 +2968,7 @@
       </w:tr>
     </w:tbl>
     <w:sectPr>
-      <w:pgSz w:w="12240" w:h="15840" w:orient="portrait"/>
+      <w:pgSz w:w="11906" w:h="16838" w:orient="portrait"/>
       <w:pgMar w:top="1080" w:right="1080" w:bottom="1080" w:left="1080" w:header="708" w:footer="708" w:gutter="0"/>
       <w:pgNumType/>
       <w:docGrid w:linePitch="360"/>

</xml_diff>